<commit_message>
feat: provjera osnovnog teksta (priča 2.1)
Co-Authored-By: Claude Opus 5.5 <noreply@anthropic.com>
</commit_message>
<xml_diff>
--- a/tests/referentni/vjezba_1/gutter.docx
+++ b/tests/referentni/vjezba_1/gutter.docx
@@ -19,7 +19,82 @@
     </w:p>
     <w:p>
       <w:r>
+        <w:t>Sažetak</w:t>
+      </w:r>
+    </w:p>
+    <w:p>
+      <w:r>
+        <w:t>Rad ukratko opisuje izbor studija i ciljeve studiranja.</w:t>
+      </w:r>
+    </w:p>
+    <w:p>
+      <w:pPr>
+        <w:pStyle w:val="Heading1"/>
+      </w:pPr>
+      <w:r>
         <w:t>Uvod</w:t>
+      </w:r>
+    </w:p>
+    <w:p>
+      <w:r>
+        <w:t>Ovo je osnovni tekst poglavlja Uvod.</w:t>
+      </w:r>
+    </w:p>
+    <w:p>
+      <w:r>
+        <w:t>Drugi odlomak osnovnog teksta istog poglavlja.</w:t>
+      </w:r>
+    </w:p>
+    <w:p>
+      <w:pPr>
+        <w:pStyle w:val="Heading1"/>
+      </w:pPr>
+      <w:r>
+        <w:t>Studij geodezije i geomatike u Varaždinu</w:t>
+      </w:r>
+    </w:p>
+    <w:p>
+      <w:r>
+        <w:t>Ovo je osnovni tekst poglavlja Studij geodezije i geomatike u Varaždinu.</w:t>
+      </w:r>
+    </w:p>
+    <w:p>
+      <w:r>
+        <w:t>Drugi odlomak osnovnog teksta istog poglavlja.</w:t>
+      </w:r>
+    </w:p>
+    <w:p>
+      <w:pPr>
+        <w:pStyle w:val="Heading1"/>
+      </w:pPr>
+      <w:r>
+        <w:t>Zaključak</w:t>
+      </w:r>
+    </w:p>
+    <w:p>
+      <w:r>
+        <w:t>Ovo je osnovni tekst poglavlja Zaključak.</w:t>
+      </w:r>
+    </w:p>
+    <w:p>
+      <w:r>
+        <w:t>Drugi odlomak osnovnog teksta istog poglavlja.</w:t>
+      </w:r>
+    </w:p>
+    <w:p>
+      <w:pPr>
+        <w:pStyle w:val="Heading1"/>
+      </w:pPr>
+      <w:r>
+        <w:t>Literatura</w:t>
+      </w:r>
+    </w:p>
+    <w:p>
+      <w:pPr>
+        <w:pStyle w:val="ListParagraph"/>
+      </w:pPr>
+      <w:r>
+        <w:t>Sveučilište Sjever, https://www.unin.hr/</w:t>
       </w:r>
     </w:p>
     <w:sectPr>
@@ -395,6 +470,14 @@
     <w:name w:val="Normal"/>
     <w:qFormat/>
     <w:rsid w:val="00FC693F"/>
+    <w:pPr>
+      <w:spacing w:before="120" w:after="120" w:line="240" w:lineRule="auto"/>
+      <w:jc w:val="both"/>
+    </w:pPr>
+    <w:rPr>
+      <w:rFonts w:ascii="Calibri" w:hAnsi="Calibri"/>
+      <w:sz w:val="24"/>
+    </w:rPr>
   </w:style>
   <w:style w:type="paragraph" w:styleId="Header">
     <w:name w:val="header"/>

</xml_diff>

<commit_message>
feat: provjera naslova poglavlja (priča 2.2)
Co-Authored-By: Claude Opus 5.5 <noreply@anthropic.com>
</commit_message>
<xml_diff>
--- a/tests/referentni/vjezba_1/gutter.docx
+++ b/tests/referentni/vjezba_1/gutter.docx
@@ -280,6 +280,23 @@
       </w:rPr>
     </w:lvl>
   </w:abstractNum>
+  <w:abstractNum w:abstractNumId="90">
+    <w:multiLevelType w:val="multilevel"/>
+    <w:lvl w:ilvl="0">
+      <w:start w:val="1"/>
+      <w:numFmt w:val="decimal"/>
+      <w:pStyle w:val="Heading1"/>
+      <w:lvlText w:val="%1."/>
+      <w:lvlJc w:val="left"/>
+    </w:lvl>
+    <w:lvl w:ilvl="1">
+      <w:start w:val="1"/>
+      <w:numFmt w:val="decimal"/>
+      <w:pStyle w:val="Heading2"/>
+      <w:lvlText w:val="%1.%2."/>
+      <w:lvlJc w:val="left"/>
+    </w:lvl>
+  </w:abstractNum>
   <w:num w:numId="1">
     <w:abstractNumId w:val="8"/>
   </w:num>
@@ -306,6 +323,9 @@
   </w:num>
   <w:num w:numId="9">
     <w:abstractNumId w:val="0"/>
+  </w:num>
+  <w:num w:numId="90">
+    <w:abstractNumId w:val="90"/>
   </w:num>
 </w:numbering>
 </file>
@@ -534,15 +554,18 @@
     <w:pPr>
       <w:keepNext/>
       <w:keepLines/>
-      <w:spacing w:before="480" w:after="0"/>
+      <w:numPr>
+        <w:numId w:val="90"/>
+      </w:numPr>
+      <w:spacing w:before="120" w:after="120"/>
+      <w:jc w:val="left"/>
       <w:outlineLvl w:val="0"/>
     </w:pPr>
     <w:rPr>
-      <w:rFonts w:asciiTheme="majorHAnsi" w:eastAsiaTheme="majorEastAsia" w:hAnsiTheme="majorHAnsi" w:cstheme="majorBidi"/>
+      <w:rFonts w:eastAsiaTheme="majorEastAsia" w:cstheme="majorBidi" w:ascii="Calibri" w:hAnsi="Calibri"/>
       <w:b/>
       <w:bCs/>
-      <w:color w:val="365F91" w:themeColor="accent1" w:themeShade="BF"/>
-      <w:sz w:val="28"/>
+      <w:sz w:val="24"/>
       <w:szCs w:val="28"/>
     </w:rPr>
   </w:style>

</xml_diff>

<commit_message>
feat: provjera numeriranja stranica (priča 2.5)
Co-Authored-By: Claude Opus 5.5 <noreply@anthropic.com>
</commit_message>
<xml_diff>
--- a/tests/referentni/vjezba_1/gutter.docx
+++ b/tests/referentni/vjezba_1/gutter.docx
@@ -101,6 +101,7 @@
       </w:r>
     </w:p>
     <w:sectPr>
+      <w:footerReference w:type="default" r:id="rId9"/>
       <w:pgSz w:w="11906" w:h="16838"/>
       <w:pgMar w:top="1361" w:right="1531" w:bottom="1644" w:left="1474" w:header="720" w:footer="720" w:gutter="283"/>
       <w:cols w:space="720"/>
@@ -108,6 +109,32 @@
     </w:sectPr>
   </w:body>
 </w:document>
+</file>
+
+<file path=word/footer1.xml><?xml version="1.0" encoding="utf-8"?>
+<w:ftr xmlns:m="http://schemas.openxmlformats.org/officeDocument/2006/math" xmlns:mc="http://schemas.openxmlformats.org/markup-compatibility/2006" xmlns:mo="http://schemas.microsoft.com/office/mac/office/2008/main" xmlns:mv="urn:schemas-microsoft-com:mac:vml" xmlns:o="urn:schemas-microsoft-com:office:office" xmlns:r="http://schemas.openxmlformats.org/officeDocument/2006/relationships" xmlns:v="urn:schemas-microsoft-com:vml" xmlns:w10="urn:schemas-microsoft-com:office:word" xmlns:w14="http://schemas.microsoft.com/office/word/2010/wordml" xmlns:w="http://schemas.openxmlformats.org/wordprocessingml/2006/main" xmlns:wne="http://schemas.microsoft.com/office/word/2006/wordml" xmlns:wp14="http://schemas.microsoft.com/office/word/2010/wordprocessingDrawing" xmlns:wp="http://schemas.openxmlformats.org/drawingml/2006/wordprocessingDrawing" xmlns:wpc="http://schemas.microsoft.com/office/word/2010/wordprocessingCanvas" xmlns:wpg="http://schemas.microsoft.com/office/word/2010/wordprocessingGroup" xmlns:wpi="http://schemas.microsoft.com/office/word/2010/wordprocessingInk" xmlns:wps="http://schemas.microsoft.com/office/word/2010/wordprocessingShape" mc:Ignorable="w14 wp14">
+  <w:p>
+    <w:pPr>
+      <w:pStyle w:val="Footer"/>
+      <w:jc w:val="center"/>
+    </w:pPr>
+    <w:r>
+      <w:fldChar w:fldCharType="begin"/>
+    </w:r>
+    <w:r>
+      <w:instrText xml:space="preserve"> PAGE   \* MERGEFORMAT </w:instrText>
+    </w:r>
+    <w:r>
+      <w:fldChar w:fldCharType="separate"/>
+    </w:r>
+    <w:r>
+      <w:t>2</w:t>
+    </w:r>
+    <w:r>
+      <w:fldChar w:fldCharType="end"/>
+    </w:r>
+  </w:p>
+</w:ftr>
 </file>
 
 <file path=word/numbering.xml><?xml version="1.0" encoding="utf-8"?>
@@ -538,6 +565,10 @@
       </w:tabs>
       <w:spacing w:after="0" w:line="240" w:lineRule="auto"/>
     </w:pPr>
+    <w:rPr>
+      <w:rFonts w:ascii="Calibri" w:hAnsi="Calibri"/>
+      <w:sz w:val="20"/>
+    </w:rPr>
   </w:style>
   <w:style w:type="character" w:customStyle="1" w:styleId="FooterChar">
     <w:name w:val="Footer Char"/>

</xml_diff>